<commit_message>
backup: MTD sales monitor 2026-09-02
</commit_message>
<xml_diff>
--- a/McFarlane_DC_Sales_Alerts_PRD.docx
+++ b/McFarlane_DC_Sales_Alerts_PRD.docx
@@ -12,17 +12,17 @@
     </w:p>
     <w:p>
       <w:r>
-        <w:t xml:space="preserve">Version: 1.0  </w:t>
+        <w:t xml:space="preserve">Version: 1.1  </w:t>
       </w:r>
     </w:p>
     <w:p>
       <w:r>
-        <w:t xml:space="preserve">Last updated: 2026-09-01 EDT  </w:t>
+        <w:t xml:space="preserve">Last updated: 2026-09-02 EDT  </w:t>
       </w:r>
     </w:p>
     <w:p>
       <w:r>
-        <w:t xml:space="preserve">Implementation signature: `decf9fb33a6c`  </w:t>
+        <w:t xml:space="preserve">Implementation signature: `b4db85cc9559`  </w:t>
       </w:r>
     </w:p>
     <w:p>
@@ -165,7 +165,47 @@
         <w:pStyle w:val="ListNumber"/>
       </w:pPr>
       <w:r>
+        <w:t>Preserve the normalized buyer wallet from the Rarible activity, then resolve a buyer Name Tag only when exactly one local PolygonScan alias record matches the wallet.</w:t>
+      </w:r>
+    </w:p>
+    <w:p>
+      <w:pPr>
+        <w:pStyle w:val="ListNumber"/>
+      </w:pPr>
+      <w:r>
         <w:t>Atomically update recent-sale history, collection last-sale data, baseline, and a pending WhatsApp sale event.</w:t>
+      </w:r>
+    </w:p>
+    <w:p>
+      <w:pPr>
+        <w:pStyle w:val="Heading1"/>
+      </w:pPr>
+      <w:r>
+        <w:t>Last-purchase history</w:t>
+      </w:r>
+    </w:p>
+    <w:p>
+      <w:pPr>
+        <w:pStyle w:val="ListBullet"/>
+      </w:pPr>
+      <w:r>
+        <w:t>Private sale history retains both `buyer_wallet` and, where a unique local match exists, `buyer_name_tag`.</w:t>
+      </w:r>
+    </w:p>
+    <w:p>
+      <w:pPr>
+        <w:pStyle w:val="ListBullet"/>
+      </w:pPr>
+      <w:r>
+        <w:t>A saved Name Tag is preferred in history displays; otherwise the saved buyer wallet is used. Missing historical buyer data is rendered as `Buyer not recorded` rather than inferred.</w:t>
+      </w:r>
+    </w:p>
+    <w:p>
+      <w:pPr>
+        <w:pStyle w:val="ListBullet"/>
+      </w:pPr>
+      <w:r>
+        <w:t>Alias resolution is local-only: exact wallet aliases take precedence, then a unique case-insensitive masked-address prefix/suffix match. Ambiguous or unmatched records are never assigned a Name Tag.</w:t>
       </w:r>
     </w:p>
     <w:p>
@@ -239,7 +279,7 @@
     </w:p>
     <w:p>
       <w:r>
-        <w:t>A sale line includes collection display name, item name, verified rarity or `Unknown`, price/payment asset, quantity, and sale time.</w:t>
+        <w:t>A sale line includes collection display name, item name, verified rarity or `Unknown`, price/payment asset, sale time, and buyer identity. A uniquely resolved Name Tag is preferred; an unmatched wallet is privacy-masked in outbound alerts.</w:t>
       </w:r>
     </w:p>
     <w:p>
@@ -284,7 +324,7 @@
         <w:pStyle w:val="ListBullet"/>
       </w:pPr>
       <w:r>
-        <w:t>Public reports do not expose internal baseline IDs, API credentials, or diagnostic logs.</w:t>
+        <w:t>Public reports do not expose internal baseline IDs, API credentials, or diagnostic logs. Raw buyer wallets remain private-state data; outbound alerts use a verified Name Tag where available or a privacy-masked wallet suffix.</w:t>
       </w:r>
     </w:p>
     <w:p>

</xml_diff>

<commit_message>
backup: MTD sales monitor 2026-09-03
</commit_message>
<xml_diff>
--- a/McFarlane_DC_Sales_Alerts_PRD.docx
+++ b/McFarlane_DC_Sales_Alerts_PRD.docx
@@ -17,12 +17,12 @@
     </w:p>
     <w:p>
       <w:r>
-        <w:t xml:space="preserve">Last updated: 2026-09-02 EDT  </w:t>
+        <w:t xml:space="preserve">Last updated: 2026-09-03 EDT  </w:t>
       </w:r>
     </w:p>
     <w:p>
       <w:r>
-        <w:t xml:space="preserve">Implementation signature: `b4db85cc9559`  </w:t>
+        <w:t xml:space="preserve">Implementation signature: `9f133a2fc0ff`  </w:t>
       </w:r>
     </w:p>
     <w:p>

</xml_diff>

<commit_message>
backup: MTD sales monitor 2026-09-04
</commit_message>
<xml_diff>
--- a/McFarlane_DC_Sales_Alerts_PRD.docx
+++ b/McFarlane_DC_Sales_Alerts_PRD.docx
@@ -17,12 +17,12 @@
     </w:p>
     <w:p>
       <w:r>
-        <w:t xml:space="preserve">Last updated: 2026-09-03 EDT  </w:t>
+        <w:t xml:space="preserve">Last updated: 2026-09-04 EDT  </w:t>
       </w:r>
     </w:p>
     <w:p>
       <w:r>
-        <w:t xml:space="preserve">Implementation signature: `9f133a2fc0ff`  </w:t>
+        <w:t xml:space="preserve">Implementation signature: `c89bc92c811a`  </w:t>
       </w:r>
     </w:p>
     <w:p>

</xml_diff>

<commit_message>
backup: MTD sales monitor 2026-09-05
</commit_message>
<xml_diff>
--- a/McFarlane_DC_Sales_Alerts_PRD.docx
+++ b/McFarlane_DC_Sales_Alerts_PRD.docx
@@ -17,12 +17,12 @@
     </w:p>
     <w:p>
       <w:r>
-        <w:t xml:space="preserve">Last updated: 2026-09-04 EDT  </w:t>
+        <w:t xml:space="preserve">Last updated: 2026-09-05 EDT  </w:t>
       </w:r>
     </w:p>
     <w:p>
       <w:r>
-        <w:t xml:space="preserve">Implementation signature: `c89bc92c811a`  </w:t>
+        <w:t xml:space="preserve">Implementation signature: `351345bcf4e3`  </w:t>
       </w:r>
     </w:p>
     <w:p>

</xml_diff>

<commit_message>
backup: MTD sales monitor 2026-09-06
</commit_message>
<xml_diff>
--- a/McFarlane_DC_Sales_Alerts_PRD.docx
+++ b/McFarlane_DC_Sales_Alerts_PRD.docx
@@ -17,12 +17,12 @@
     </w:p>
     <w:p>
       <w:r>
-        <w:t xml:space="preserve">Last updated: 2026-09-05 EDT  </w:t>
+        <w:t xml:space="preserve">Last updated: 2026-09-06 EDT  </w:t>
       </w:r>
     </w:p>
     <w:p>
       <w:r>
-        <w:t xml:space="preserve">Implementation signature: `351345bcf4e3`  </w:t>
+        <w:t xml:space="preserve">Implementation signature: `acbcf417d10d`  </w:t>
       </w:r>
     </w:p>
     <w:p>

</xml_diff>

<commit_message>
backup: MTD sales monitor 2026-09-07
</commit_message>
<xml_diff>
--- a/McFarlane_DC_Sales_Alerts_PRD.docx
+++ b/McFarlane_DC_Sales_Alerts_PRD.docx
@@ -17,12 +17,12 @@
     </w:p>
     <w:p>
       <w:r>
-        <w:t xml:space="preserve">Last updated: 2026-09-06 EDT  </w:t>
+        <w:t xml:space="preserve">Last updated: 2026-09-07 EDT  </w:t>
       </w:r>
     </w:p>
     <w:p>
       <w:r>
-        <w:t xml:space="preserve">Implementation signature: `acbcf417d10d`  </w:t>
+        <w:t xml:space="preserve">Implementation signature: `69b70c8aa132`  </w:t>
       </w:r>
     </w:p>
     <w:p>

</xml_diff>

<commit_message>
backup: MTD sales monitor 2026-09-08
</commit_message>
<xml_diff>
--- a/McFarlane_DC_Sales_Alerts_PRD.docx
+++ b/McFarlane_DC_Sales_Alerts_PRD.docx
@@ -17,12 +17,12 @@
     </w:p>
     <w:p>
       <w:r>
-        <w:t xml:space="preserve">Last updated: 2026-09-07 EDT  </w:t>
+        <w:t xml:space="preserve">Last updated: 2026-09-08 EDT  </w:t>
       </w:r>
     </w:p>
     <w:p>
       <w:r>
-        <w:t xml:space="preserve">Implementation signature: `69b70c8aa132`  </w:t>
+        <w:t xml:space="preserve">Implementation signature: `824c4aa29a06`  </w:t>
       </w:r>
     </w:p>
     <w:p>

</xml_diff>

<commit_message>
backup: MTD sales monitor 2026-09-09
</commit_message>
<xml_diff>
--- a/McFarlane_DC_Sales_Alerts_PRD.docx
+++ b/McFarlane_DC_Sales_Alerts_PRD.docx
@@ -17,12 +17,12 @@
     </w:p>
     <w:p>
       <w:r>
-        <w:t xml:space="preserve">Last updated: 2026-09-08 EDT  </w:t>
+        <w:t xml:space="preserve">Last updated: 2026-09-09 EDT  </w:t>
       </w:r>
     </w:p>
     <w:p>
       <w:r>
-        <w:t xml:space="preserve">Implementation signature: `824c4aa29a06`  </w:t>
+        <w:t xml:space="preserve">Implementation signature: `808a616d4689`  </w:t>
       </w:r>
     </w:p>
     <w:p>

</xml_diff>

<commit_message>
backup: MTD sales monitor 2026-09-10
</commit_message>
<xml_diff>
--- a/McFarlane_DC_Sales_Alerts_PRD.docx
+++ b/McFarlane_DC_Sales_Alerts_PRD.docx
@@ -17,12 +17,12 @@
     </w:p>
     <w:p>
       <w:r>
-        <w:t xml:space="preserve">Last updated: 2026-09-09 EDT  </w:t>
+        <w:t xml:space="preserve">Last updated: 2026-09-10 EDT  </w:t>
       </w:r>
     </w:p>
     <w:p>
       <w:r>
-        <w:t xml:space="preserve">Implementation signature: `808a616d4689`  </w:t>
+        <w:t xml:space="preserve">Implementation signature: `92c656eb8342`  </w:t>
       </w:r>
     </w:p>
     <w:p>

</xml_diff>

<commit_message>
backup: MTD sales monitor 2026-09-11
</commit_message>
<xml_diff>
--- a/McFarlane_DC_Sales_Alerts_PRD.docx
+++ b/McFarlane_DC_Sales_Alerts_PRD.docx
@@ -17,12 +17,12 @@
     </w:p>
     <w:p>
       <w:r>
-        <w:t xml:space="preserve">Last updated: 2026-09-10 EDT  </w:t>
+        <w:t xml:space="preserve">Last updated: 2026-09-11 EDT  </w:t>
       </w:r>
     </w:p>
     <w:p>
       <w:r>
-        <w:t xml:space="preserve">Implementation signature: `92c656eb8342`  </w:t>
+        <w:t xml:space="preserve">Implementation signature: `5ffd6974864c`  </w:t>
       </w:r>
     </w:p>
     <w:p>

</xml_diff>

<commit_message>
backup: MTD sales monitor 2026-09-12
</commit_message>
<xml_diff>
--- a/McFarlane_DC_Sales_Alerts_PRD.docx
+++ b/McFarlane_DC_Sales_Alerts_PRD.docx
@@ -17,12 +17,12 @@
     </w:p>
     <w:p>
       <w:r>
-        <w:t xml:space="preserve">Last updated: 2026-09-11 EDT  </w:t>
+        <w:t xml:space="preserve">Last updated: 2026-09-12 EDT  </w:t>
       </w:r>
     </w:p>
     <w:p>
       <w:r>
-        <w:t xml:space="preserve">Implementation signature: `5ffd6974864c`  </w:t>
+        <w:t xml:space="preserve">Implementation signature: `5e51c83090e3`  </w:t>
       </w:r>
     </w:p>
     <w:p>

</xml_diff>